<commit_message>
Move Android Studio project to android/Rayy and name Firebase project Rayy
Co-Authored-By: Claude Opus 5.5 <noreply@anthropic.com>
Claude-Session: https://claude.ai/code/session_01LUEXdLPnpgGnWTyNRXft8r
</commit_message>
<xml_diff>
--- a/rayy/docs/Rayy-Documentation.docx
+++ b/rayy/docs/Rayy-Documentation.docx
@@ -533,18 +533,34 @@
               <w:rPr>
                 <w:rStyle w:val="VerbatimChar"/>
               </w:rPr>
-              <w:t xml:space="preserve">android/</w:t>
-            </w:r>
-          </w:p>
-        </w:tc>
-        <w:tc>
-          <w:tcPr/>
-          <w:p>
-            <w:pPr>
-              <w:pStyle w:val="Compact"/>
-            </w:pPr>
-            <w:r>
-              <w:t xml:space="preserve">Android application (Kotlin + Jetpack Compose, Arabic / English)</w:t>
+              <w:t xml:space="preserve">android/Rayy/</w:t>
+            </w:r>
+          </w:p>
+        </w:tc>
+        <w:tc>
+          <w:tcPr/>
+          <w:p>
+            <w:pPr>
+              <w:pStyle w:val="Compact"/>
+            </w:pPr>
+            <w:r>
+              <w:t xml:space="preserve">Android Studio project</w:t>
+            </w:r>
+            <w:r>
+              <w:t xml:space="preserve"> </w:t>
+            </w:r>
+            <w:r>
+              <w:rPr>
+                <w:b/>
+                <w:bCs/>
+              </w:rPr>
+              <w:t xml:space="preserve">Rayy</w:t>
+            </w:r>
+            <w:r>
+              <w:t xml:space="preserve"> </w:t>
+            </w:r>
+            <w:r>
+              <w:t xml:space="preserve">(Kotlin + Jetpack Compose, Arabic / English)</w:t>
             </w:r>
           </w:p>
         </w:tc>
@@ -1173,7 +1189,7 @@
         <w:rPr>
           <w:rStyle w:val="VerbatimChar"/>
         </w:rPr>
-        <w:t xml:space="preserve">android/app/</w:t>
+        <w:t xml:space="preserve">android/Rayy/app/</w:t>
       </w:r>
       <w:r>
         <w:t xml:space="preserve">, open</w:t>
@@ -1185,7 +1201,7 @@
         <w:rPr>
           <w:rStyle w:val="VerbatimChar"/>
         </w:rPr>
-        <w:t xml:space="preserve">android/</w:t>
+        <w:t xml:space="preserve">android/Rayy/</w:t>
       </w:r>
       <w:r>
         <w:t xml:space="preserve"> </w:t>
@@ -2433,7 +2449,7 @@
         <w:t xml:space="preserve"> </w:t>
       </w:r>
       <w:r>
-        <w:t xml:space="preserve">→</w:t>
+        <w:t xml:space="preserve">→ project name</w:t>
       </w:r>
       <w:r>
         <w:t xml:space="preserve"> </w:t>
@@ -2441,11 +2457,25 @@
       <w:r>
         <w:rPr>
           <w:rStyle w:val="VerbatimChar"/>
-        </w:rPr>
-        <w:t xml:space="preserve">rayy</w:t>
-      </w:r>
-      <w:r>
-        <w:t xml:space="preserve">.</w:t>
+          <w:b/>
+          <w:bCs/>
+        </w:rPr>
+        <w:t xml:space="preserve">Rayy</w:t>
+      </w:r>
+      <w:r>
+        <w:t xml:space="preserve">. Firebase makes a unique project ID from it (for example</w:t>
+      </w:r>
+      <w:r>
+        <w:t xml:space="preserve"> </w:t>
+      </w:r>
+      <w:r>
+        <w:rPr>
+          <w:rStyle w:val="VerbatimChar"/>
+        </w:rPr>
+        <w:t xml:space="preserve">rayy-1a2b3</w:t>
+      </w:r>
+      <w:r>
+        <w:t xml:space="preserve">); that is normal.</w:t>
       </w:r>
     </w:p>
     <w:p>
@@ -2686,8 +2716,24 @@
       <w:r>
         <w:rPr>
           <w:rStyle w:val="VerbatimChar"/>
+          <w:b/>
+          <w:bCs/>
         </w:rPr>
         <w:t xml:space="preserve">com.rayy.app</w:t>
+      </w:r>
+      <w:r>
+        <w:t xml:space="preserve">, app nickname</w:t>
+      </w:r>
+      <w:r>
+        <w:t xml:space="preserve"> </w:t>
+      </w:r>
+      <w:r>
+        <w:rPr>
+          <w:rStyle w:val="VerbatimChar"/>
+          <w:b/>
+          <w:bCs/>
+        </w:rPr>
+        <w:t xml:space="preserve">Rayy</w:t>
       </w:r>
       <w:r>
         <w:t xml:space="preserve"> </w:t>
@@ -4161,7 +4207,7 @@
           <w:b/>
           <w:bCs/>
         </w:rPr>
-        <w:t xml:space="preserve">android/app/</w:t>
+        <w:t xml:space="preserve">android/Rayy/app/</w:t>
       </w:r>
       <w:r>
         <w:t xml:space="preserve">.</w:t>
@@ -4203,13 +4249,26 @@
           <w:b/>
           <w:bCs/>
         </w:rPr>
-        <w:t xml:space="preserve">android</w:t>
-      </w:r>
-      <w:r>
-        <w:t xml:space="preserve"> </w:t>
-      </w:r>
-      <w:r>
-        <w:t xml:space="preserve">folder → wait for</w:t>
+        <w:t xml:space="preserve">android/Rayy</w:t>
+      </w:r>
+      <w:r>
+        <w:t xml:space="preserve"> </w:t>
+      </w:r>
+      <w:r>
+        <w:t xml:space="preserve">folder (the project name shows as</w:t>
+      </w:r>
+      <w:r>
+        <w:t xml:space="preserve"> </w:t>
+      </w:r>
+      <w:r>
+        <w:rPr>
+          <w:b/>
+          <w:bCs/>
+        </w:rPr>
+        <w:t xml:space="preserve">Rayy</w:t>
+      </w:r>
+      <w:r>
+        <w:t xml:space="preserve">) → wait for</w:t>
       </w:r>
       <w:r>
         <w:t xml:space="preserve"> </w:t>
@@ -4293,7 +4352,7 @@
         <w:rPr>
           <w:rStyle w:val="VerbatimChar"/>
         </w:rPr>
-        <w:t xml:space="preserve">android/app/build/outputs/apk/debug/app-debug.apk</w:t>
+        <w:t xml:space="preserve">android/Rayy/app/build/outputs/apk/debug/app-debug.apk</w:t>
       </w:r>
       <w:r>
         <w:t xml:space="preserve">.</w:t>
@@ -12170,7 +12229,7 @@
         <w:t xml:space="preserve"> </w:t>
       </w:r>
       <w:r>
-        <w:t xml:space="preserve">→ name it</w:t>
+        <w:t xml:space="preserve">→ project name</w:t>
       </w:r>
       <w:r>
         <w:t xml:space="preserve"> </w:t>
@@ -12178,8 +12237,10 @@
       <w:r>
         <w:rPr>
           <w:rStyle w:val="VerbatimChar"/>
-        </w:rPr>
-        <w:t xml:space="preserve">rayy</w:t>
+          <w:b/>
+          <w:bCs/>
+        </w:rPr>
+        <w:t xml:space="preserve">Rayy</w:t>
       </w:r>
       <w:r>
         <w:t xml:space="preserve"> </w:t>
@@ -12212,6 +12273,59 @@
           <w:bCs/>
         </w:rPr>
         <w:t xml:space="preserve">Create project</w:t>
+      </w:r>
+      <w:r>
+        <w:t xml:space="preserve">.</w:t>
+      </w:r>
+      <w:r>
+        <w:t xml:space="preserve"> </w:t>
+      </w:r>
+      <w:r>
+        <w:t xml:space="preserve">Firebase builds a unique</w:t>
+      </w:r>
+      <w:r>
+        <w:t xml:space="preserve"> </w:t>
+      </w:r>
+      <w:r>
+        <w:rPr>
+          <w:b/>
+          <w:bCs/>
+        </w:rPr>
+        <w:t xml:space="preserve">project ID</w:t>
+      </w:r>
+      <w:r>
+        <w:t xml:space="preserve"> </w:t>
+      </w:r>
+      <w:r>
+        <w:t xml:space="preserve">from the name (for example</w:t>
+      </w:r>
+      <w:r>
+        <w:t xml:space="preserve"> </w:t>
+      </w:r>
+      <w:r>
+        <w:rPr>
+          <w:rStyle w:val="VerbatimChar"/>
+        </w:rPr>
+        <w:t xml:space="preserve">rayy-1a2b3</w:t>
+      </w:r>
+      <w:r>
+        <w:t xml:space="preserve">, shown under the name field).</w:t>
+      </w:r>
+      <w:r>
+        <w:t xml:space="preserve"> </w:t>
+      </w:r>
+      <w:r>
+        <w:t xml:space="preserve">The ID appears in your database URL and web address; the project name shown everywhere stays</w:t>
+      </w:r>
+      <w:r>
+        <w:t xml:space="preserve"> </w:t>
+      </w:r>
+      <w:r>
+        <w:rPr>
+          <w:b/>
+          <w:bCs/>
+        </w:rPr>
+        <w:t xml:space="preserve">Rayy</w:t>
       </w:r>
       <w:r>
         <w:t xml:space="preserve">.</w:t>
@@ -12687,8 +12801,10 @@
       <w:r>
         <w:rPr>
           <w:rStyle w:val="VerbatimChar"/>
-        </w:rPr>
-        <w:t xml:space="preserve">rayy-web</w:t>
+          <w:b/>
+          <w:bCs/>
+        </w:rPr>
+        <w:t xml:space="preserve">Rayy Web</w:t>
       </w:r>
       <w:r>
         <w:t xml:space="preserve"> </w:t>
@@ -12952,6 +13068,35 @@
         <w:t xml:space="preserve"> </w:t>
       </w:r>
       <w:r>
+        <w:t xml:space="preserve">(it must be exactly this; it is set in</w:t>
+      </w:r>
+      <w:r>
+        <w:t xml:space="preserve"> </w:t>
+      </w:r>
+      <w:r>
+        <w:rPr>
+          <w:rStyle w:val="VerbatimChar"/>
+        </w:rPr>
+        <w:t xml:space="preserve">android/Rayy/app/build.gradle.kts</w:t>
+      </w:r>
+      <w:r>
+        <w:t xml:space="preserve">), app nickname</w:t>
+      </w:r>
+      <w:r>
+        <w:t xml:space="preserve"> </w:t>
+      </w:r>
+      <w:r>
+        <w:rPr>
+          <w:rStyle w:val="VerbatimChar"/>
+          <w:b/>
+          <w:bCs/>
+        </w:rPr>
+        <w:t xml:space="preserve">Rayy</w:t>
+      </w:r>
+      <w:r>
+        <w:t xml:space="preserve"> </w:t>
+      </w:r>
+      <w:r>
         <w:t xml:space="preserve">→ Register.</w:t>
       </w:r>
     </w:p>
@@ -12992,7 +13137,7 @@
           <w:b/>
           <w:bCs/>
         </w:rPr>
-        <w:t xml:space="preserve">android/app/google-services.json</w:t>
+        <w:t xml:space="preserve">android/Rayy/app/google-services.json</w:t>
       </w:r>
       <w:r>
         <w:t xml:space="preserve">.</w:t>
@@ -17571,7 +17716,7 @@
         <w:rPr>
           <w:rStyle w:val="VerbatimChar"/>
         </w:rPr>
-        <w:t xml:space="preserve">android/</w:t>
+        <w:t xml:space="preserve">android/Rayy/</w:t>
       </w:r>
       <w:r>
         <w:t xml:space="preserve">, a</w:t>
@@ -17970,7 +18115,7 @@
           <w:b/>
           <w:bCs/>
         </w:rPr>
-        <w:t xml:space="preserve">android/app/</w:t>
+        <w:t xml:space="preserve">android/Rayy/app/</w:t>
       </w:r>
       <w:r>
         <w:t xml:space="preserve">. Without it the build fails with</w:t>
@@ -18025,13 +18170,26 @@
           <w:b/>
           <w:bCs/>
         </w:rPr>
-        <w:t xml:space="preserve">android</w:t>
-      </w:r>
-      <w:r>
-        <w:t xml:space="preserve"> </w:t>
-      </w:r>
-      <w:r>
-        <w:t xml:space="preserve">folder → wait for</w:t>
+        <w:t xml:space="preserve">android/Rayy</w:t>
+      </w:r>
+      <w:r>
+        <w:t xml:space="preserve"> </w:t>
+      </w:r>
+      <w:r>
+        <w:t xml:space="preserve">folder (Android Studio shows the project name</w:t>
+      </w:r>
+      <w:r>
+        <w:t xml:space="preserve"> </w:t>
+      </w:r>
+      <w:r>
+        <w:rPr>
+          <w:b/>
+          <w:bCs/>
+        </w:rPr>
+        <w:t xml:space="preserve">Rayy</w:t>
+      </w:r>
+      <w:r>
+        <w:t xml:space="preserve">) → wait for</w:t>
       </w:r>
       <w:r>
         <w:t xml:space="preserve"> </w:t>
@@ -18157,7 +18315,7 @@
         <w:rPr>
           <w:rStyle w:val="VerbatimChar"/>
         </w:rPr>
-        <w:t xml:space="preserve">android/app/build/outputs/apk/debug/app-debug.apk</w:t>
+        <w:t xml:space="preserve">android/Rayy/app/build/outputs/apk/debug/app-debug.apk</w:t>
       </w:r>
       <w:r>
         <w:t xml:space="preserve">. Send it to the phone and install it (</w:t>
@@ -18222,7 +18380,7 @@
         <w:rPr>
           <w:rStyle w:val="VerbatimChar"/>
         </w:rPr>
-        <w:t xml:space="preserve">android/</w:t>
+        <w:t xml:space="preserve">android/Rayy/                 ← open this folder in Android Studio (project "Rayy")</w:t>
       </w:r>
       <w:r>
         <w:br/>

</xml_diff>

<commit_message>
Fix Android build on Windows paths with Arabic letters
- Add android.overridePathCheck=true and longer HTTP timeouts
- Align Gradle/AGP/Kotlin and library versions with a project that
  already builds on the team's machine (Gradle 8.7, AGP 8.5.0,
  Kotlin 2.0.21, Compose BoM 2024.09.00, Firebase BoM 33.1.0)
- Document the English-only folder path requirement

Co-Authored-By: Claude Opus 5.5 <noreply@anthropic.com>
Claude-Session: https://claude.ai/code/session_01LUEXdLPnpgGnWTyNRXft8r
</commit_message>
<xml_diff>
--- a/rayy/docs/Rayy-Documentation.docx
+++ b/rayy/docs/Rayy-Documentation.docx
@@ -4181,6 +4181,58 @@
         </w:numPr>
       </w:pPr>
       <w:r>
+        <w:t xml:space="preserve">Unzip the project into a folder whose path has</w:t>
+      </w:r>
+      <w:r>
+        <w:t xml:space="preserve"> </w:t>
+      </w:r>
+      <w:r>
+        <w:rPr>
+          <w:b/>
+          <w:bCs/>
+        </w:rPr>
+        <w:t xml:space="preserve">English letters only</w:t>
+      </w:r>
+      <w:r>
+        <w:t xml:space="preserve">, for example</w:t>
+      </w:r>
+      <w:r>
+        <w:t xml:space="preserve"> </w:t>
+      </w:r>
+      <w:r>
+        <w:rPr>
+          <w:rStyle w:val="VerbatimChar"/>
+        </w:rPr>
+        <w:t xml:space="preserve">E:\Rayy-Project</w:t>
+      </w:r>
+      <w:r>
+        <w:t xml:space="preserve"> </w:t>
+      </w:r>
+      <w:r>
+        <w:t xml:space="preserve">(not</w:t>
+      </w:r>
+      <w:r>
+        <w:t xml:space="preserve"> </w:t>
+      </w:r>
+      <w:r>
+        <w:rPr>
+          <w:rStyle w:val="VerbatimChar"/>
+        </w:rPr>
+        <w:t xml:space="preserve">E:\Ray ري\...</w:t>
+      </w:r>
+      <w:r>
+        <w:t xml:space="preserve">). Android Studio refuses to build in folders with Arabic letters in the path.</w:t>
+      </w:r>
+    </w:p>
+    <w:p>
+      <w:pPr>
+        <w:pStyle w:val="Compact"/>
+        <w:numPr>
+          <w:ilvl w:val="0"/>
+          <w:numId w:val="1012"/>
+        </w:numPr>
+      </w:pPr>
+      <w:r>
         <w:t xml:space="preserve">Copy</w:t>
       </w:r>
       <w:r>
@@ -18080,6 +18132,125 @@
     </w:p>
     <w:p>
       <w:pPr>
+        <w:pStyle w:val="BlockText"/>
+      </w:pPr>
+      <w:r>
+        <w:t xml:space="preserve">⚠️</w:t>
+      </w:r>
+      <w:r>
+        <w:t xml:space="preserve"> </w:t>
+      </w:r>
+      <w:r>
+        <w:rPr>
+          <w:b/>
+          <w:bCs/>
+        </w:rPr>
+        <w:t xml:space="preserve">Folder path: English letters only.</w:t>
+      </w:r>
+      <w:r>
+        <w:t xml:space="preserve"> </w:t>
+      </w:r>
+      <w:r>
+        <w:t xml:space="preserve">Put the project in a folder whose full path has</w:t>
+      </w:r>
+      <w:r>
+        <w:t xml:space="preserve"> </w:t>
+      </w:r>
+      <w:r>
+        <w:rPr>
+          <w:b/>
+          <w:bCs/>
+        </w:rPr>
+        <w:t xml:space="preserve">no Arabic letters</w:t>
+      </w:r>
+      <w:r>
+        <w:t xml:space="preserve">,</w:t>
+      </w:r>
+      <w:r>
+        <w:t xml:space="preserve"> </w:t>
+      </w:r>
+      <w:r>
+        <w:t xml:space="preserve">for example</w:t>
+      </w:r>
+      <w:r>
+        <w:t xml:space="preserve"> </w:t>
+      </w:r>
+      <w:r>
+        <w:rPr>
+          <w:rStyle w:val="VerbatimChar"/>
+        </w:rPr>
+        <w:t xml:space="preserve">E:\Rayy-Project\android\Rayy</w:t>
+      </w:r>
+      <w:r>
+        <w:t xml:space="preserve">. A path like</w:t>
+      </w:r>
+      <w:r>
+        <w:t xml:space="preserve"> </w:t>
+      </w:r>
+      <w:r>
+        <w:rPr>
+          <w:rStyle w:val="VerbatimChar"/>
+        </w:rPr>
+        <w:t xml:space="preserve">E:\Ray ري\...</w:t>
+      </w:r>
+      <w:r>
+        <w:t xml:space="preserve"> </w:t>
+      </w:r>
+      <w:r>
+        <w:t xml:space="preserve">gives the error</w:t>
+      </w:r>
+      <w:r>
+        <w:t xml:space="preserve"> </w:t>
+      </w:r>
+      <w:r>
+        <w:rPr>
+          <w:i/>
+          <w:iCs/>
+        </w:rPr>
+        <w:t xml:space="preserve">“Your project path contains non-ASCII characters”</w:t>
+      </w:r>
+      <w:r>
+        <w:t xml:space="preserve">. The project includes</w:t>
+      </w:r>
+      <w:r>
+        <w:t xml:space="preserve"> </w:t>
+      </w:r>
+      <w:r>
+        <w:rPr>
+          <w:rStyle w:val="VerbatimChar"/>
+        </w:rPr>
+        <w:t xml:space="preserve">android.overridePathCheck=true</w:t>
+      </w:r>
+      <w:r>
+        <w:t xml:space="preserve"> </w:t>
+      </w:r>
+      <w:r>
+        <w:t xml:space="preserve">in</w:t>
+      </w:r>
+      <w:r>
+        <w:t xml:space="preserve"> </w:t>
+      </w:r>
+      <w:r>
+        <w:rPr>
+          <w:rStyle w:val="VerbatimChar"/>
+        </w:rPr>
+        <w:t xml:space="preserve">gradle.properties</w:t>
+      </w:r>
+      <w:r>
+        <w:t xml:space="preserve"> </w:t>
+      </w:r>
+      <w:r>
+        <w:t xml:space="preserve">to skip this check, but other build tools can still fail on such paths, so moving the</w:t>
+      </w:r>
+      <w:r>
+        <w:t xml:space="preserve"> </w:t>
+      </w:r>
+      <w:r>
+        <w:t xml:space="preserve">folder is the safe fix.</w:t>
+      </w:r>
+    </w:p>
+    <w:p>
+      <w:pPr>
         <w:pStyle w:val="Compact"/>
         <w:numPr>
           <w:ilvl w:val="0"/>
@@ -18207,7 +18378,7 @@
         <w:t xml:space="preserve"> </w:t>
       </w:r>
       <w:r>
-        <w:t xml:space="preserve">(the first time it downloads Gradle 8.9 and the libraries, so an internet connection is required).</w:t>
+        <w:t xml:space="preserve">(the first time it downloads Gradle 8.7 and the libraries, so an internet connection is required).</w:t>
       </w:r>
     </w:p>
     <w:p>
@@ -18389,7 +18560,7 @@
         <w:rPr>
           <w:rStyle w:val="VerbatimChar"/>
         </w:rPr>
-        <w:t xml:space="preserve">├── settings.gradle.kts, build.gradle.kts, gradle.properties, gradlew   (Gradle 8.9, AGP 8.5, Kotlin 2.0)</w:t>
+        <w:t xml:space="preserve">├── settings.gradle.kts, build.gradle.kts, gradle.properties, gradlew   (Gradle 8.7, AGP 8.5.0, Kotlin 2.0.21)</w:t>
       </w:r>
       <w:r>
         <w:br/>
@@ -18407,7 +18578,7 @@
         <w:rPr>
           <w:rStyle w:val="VerbatimChar"/>
         </w:rPr>
-        <w:t xml:space="preserve">    ├── build.gradle.kts                 dependencies: Firebase BoM 33, Compose BoM 2024.09</w:t>
+        <w:t xml:space="preserve">    ├── build.gradle.kts                 dependencies: Firebase BoM 33.1.0, Compose BoM 2024.09.00</w:t>
       </w:r>
       <w:r>
         <w:br/>
@@ -22777,33 +22948,33 @@
     </w:lvlOverride>
   </w:num>
   <w:num w:numId="1012">
-    <w:abstractNumId w:val="99411"/>
+    <w:abstractNumId w:val="99410"/>
     <w:lvlOverride w:ilvl="0">
-      <w:startOverride w:val="1"/>
+      <w:startOverride w:val="0"/>
     </w:lvlOverride>
     <w:lvlOverride w:ilvl="1">
-      <w:startOverride w:val="1"/>
+      <w:startOverride w:val="0"/>
     </w:lvlOverride>
     <w:lvlOverride w:ilvl="2">
-      <w:startOverride w:val="1"/>
+      <w:startOverride w:val="0"/>
     </w:lvlOverride>
     <w:lvlOverride w:ilvl="3">
-      <w:startOverride w:val="1"/>
+      <w:startOverride w:val="0"/>
     </w:lvlOverride>
     <w:lvlOverride w:ilvl="4">
-      <w:startOverride w:val="1"/>
+      <w:startOverride w:val="0"/>
     </w:lvlOverride>
     <w:lvlOverride w:ilvl="5">
-      <w:startOverride w:val="1"/>
+      <w:startOverride w:val="0"/>
     </w:lvlOverride>
     <w:lvlOverride w:ilvl="6">
-      <w:startOverride w:val="1"/>
+      <w:startOverride w:val="0"/>
     </w:lvlOverride>
     <w:lvlOverride w:ilvl="7">
-      <w:startOverride w:val="1"/>
+      <w:startOverride w:val="0"/>
     </w:lvlOverride>
     <w:lvlOverride w:ilvl="8">
-      <w:startOverride w:val="1"/>
+      <w:startOverride w:val="0"/>
     </w:lvlOverride>
   </w:num>
   <w:num w:numId="1013">

</xml_diff>

<commit_message>
Document Gradle JDK fix for Java 25 in Android Studio
Co-Authored-By: Claude Opus 5.5 <noreply@anthropic.com>
Claude-Session: https://claude.ai/code/session_01LUEXdLPnpgGnWTyNRXft8r
</commit_message>
<xml_diff>
--- a/rayy/docs/Rayy-Documentation.docx
+++ b/rayy/docs/Rayy-Documentation.docx
@@ -18496,6 +18496,91 @@
       </w:r>
       <w:r>
         <w:t xml:space="preserve">).</w:t>
+      </w:r>
+    </w:p>
+    <w:p>
+      <w:pPr>
+        <w:pStyle w:val="BlockText"/>
+      </w:pPr>
+      <w:r>
+        <w:rPr>
+          <w:b/>
+          <w:bCs/>
+        </w:rPr>
+        <w:t xml:space="preserve">“Incompatible Gradle JVM version … Gradle 8.7 supports Java versions between 1.8 and 21”</w:t>
+      </w:r>
+      <w:r>
+        <w:t xml:space="preserve">: Android Studio is</w:t>
+      </w:r>
+      <w:r>
+        <w:t xml:space="preserve"> </w:t>
+      </w:r>
+      <w:r>
+        <w:t xml:space="preserve">using a too-new Java (e.g. Java 25) to run Gradle. Click</w:t>
+      </w:r>
+      <w:r>
+        <w:t xml:space="preserve"> </w:t>
+      </w:r>
+      <w:r>
+        <w:rPr>
+          <w:b/>
+          <w:bCs/>
+        </w:rPr>
+        <w:t xml:space="preserve">“Apply compatible Gradle JDK configuration and sync”</w:t>
+      </w:r>
+      <w:r>
+        <w:t xml:space="preserve">, or go to</w:t>
+      </w:r>
+      <w:r>
+        <w:t xml:space="preserve"> </w:t>
+      </w:r>
+      <w:r>
+        <w:rPr>
+          <w:b/>
+          <w:bCs/>
+        </w:rPr>
+        <w:t xml:space="preserve">Settings → Build, Execution, Deployment → Build Tools → Gradle → Gradle JDK</w:t>
+      </w:r>
+      <w:r>
+        <w:t xml:space="preserve"> </w:t>
+      </w:r>
+      <w:r>
+        <w:t xml:space="preserve">and choose</w:t>
+      </w:r>
+      <w:r>
+        <w:t xml:space="preserve"> </w:t>
+      </w:r>
+      <w:r>
+        <w:rPr>
+          <w:b/>
+          <w:bCs/>
+        </w:rPr>
+        <w:t xml:space="preserve">jbr-21</w:t>
+      </w:r>
+      <w:r>
+        <w:t xml:space="preserve"> </w:t>
+      </w:r>
+      <w:r>
+        <w:t xml:space="preserve">(JetBrains</w:t>
+      </w:r>
+      <w:r>
+        <w:t xml:space="preserve"> </w:t>
+      </w:r>
+      <w:r>
+        <w:t xml:space="preserve">Runtime 21, included with Android Studio) or Java 17, then</w:t>
+      </w:r>
+      <w:r>
+        <w:t xml:space="preserve"> </w:t>
+      </w:r>
+      <w:r>
+        <w:rPr>
+          <w:b/>
+          <w:bCs/>
+        </w:rPr>
+        <w:t xml:space="preserve">File → Sync Project with Gradle Files</w:t>
+      </w:r>
+      <w:r>
+        <w:t xml:space="preserve">.</w:t>
       </w:r>
     </w:p>
     <w:p>

</xml_diff>

<commit_message>
Support Java 25 in Android Studio and add build guide
- Android: Gradle 9.1.0, AGP 9.0.1 (built-in Kotlin), Kotlin 2.2.21,
  google-services 4.4.4; remove kotlin-android plugin and kotlinOptions
- Add docs/Rayy-Build-Guide.docx: ordered steps and purpose of every file
- Update Android docs and README

Co-Authored-By: Claude Opus 5.5 <noreply@anthropic.com>
Claude-Session: https://claude.ai/code/session_01LUEXdLPnpgGnWTyNRXft8r
</commit_message>
<xml_diff>
--- a/rayy/docs/Rayy-Documentation.docx
+++ b/rayy/docs/Rayy-Documentation.docx
@@ -360,6 +360,27 @@
       </w:r>
       <w:r>
         <w:t xml:space="preserve">to the final demo, step by step.</w:t>
+      </w:r>
+    </w:p>
+    <w:p>
+      <w:pPr>
+        <w:pStyle w:val="BodyText"/>
+      </w:pPr>
+      <w:r>
+        <w:t xml:space="preserve">📘</w:t>
+      </w:r>
+      <w:r>
+        <w:t xml:space="preserve"> </w:t>
+      </w:r>
+      <w:r>
+        <w:rPr>
+          <w:b/>
+          <w:bCs/>
+        </w:rPr>
+        <w:t xml:space="preserve">docs/Rayy-Build-Guide.docx</w:t>
+      </w:r>
+      <w:r>
+        <w:t xml:space="preserve">: Word guide with every step in order (what comes after what) and what every file is for.</w:t>
       </w:r>
     </w:p>
     <w:p>
@@ -2230,7 +2251,7 @@
           <w:b/>
           <w:bCs/>
         </w:rPr>
-        <w:t xml:space="preserve">Android Studio</w:t>
+        <w:t xml:space="preserve">Android Studio Panda (2025.3.1) or newer</w:t>
       </w:r>
       <w:r>
         <w:t xml:space="preserve">:</w:t>
@@ -2250,7 +2271,7 @@
         <w:t xml:space="preserve"> </w:t>
       </w:r>
       <w:r>
-        <w:t xml:space="preserve">(for the Android app)</w:t>
+        <w:t xml:space="preserve">(for the Android app; the project uses Gradle 9.1.0 + AGP 9.0.1 and runs on Java 17–25)</w:t>
       </w:r>
     </w:p>
     <w:p>
@@ -4332,7 +4353,7 @@
         <w:t xml:space="preserve"> </w:t>
       </w:r>
       <w:r>
-        <w:t xml:space="preserve">to finish.</w:t>
+        <w:t xml:space="preserve">to finish (the first time it downloads Gradle 9.1.0).</w:t>
       </w:r>
     </w:p>
     <w:p>
@@ -18070,13 +18091,10 @@
           <w:b/>
           <w:bCs/>
         </w:rPr>
-        <w:t xml:space="preserve">Android Studio</w:t>
-      </w:r>
-      <w:r>
-        <w:t xml:space="preserve"> </w:t>
-      </w:r>
-      <w:r>
-        <w:t xml:space="preserve">(Koala 2024.1 or newer):</w:t>
+        <w:t xml:space="preserve">Android Studio Panda (2025.3.1) or newer</w:t>
+      </w:r>
+      <w:r>
+        <w:t xml:space="preserve">:</w:t>
       </w:r>
       <w:r>
         <w:t xml:space="preserve"> </w:t>
@@ -18092,6 +18110,44 @@
       <w:r>
         <w:t xml:space="preserve">. It includes the JDK and Android SDK.</w:t>
       </w:r>
+      <w:r>
+        <w:t xml:space="preserve"> </w:t>
+      </w:r>
+      <w:r>
+        <w:t xml:space="preserve">The project uses</w:t>
+      </w:r>
+      <w:r>
+        <w:t xml:space="preserve"> </w:t>
+      </w:r>
+      <w:r>
+        <w:rPr>
+          <w:b/>
+          <w:bCs/>
+        </w:rPr>
+        <w:t xml:space="preserve">Gradle 9.1.0 + Android Gradle Plugin 9.0.1 + Kotlin 2.2.21</w:t>
+      </w:r>
+      <w:r>
+        <w:t xml:space="preserve">, which run on</w:t>
+      </w:r>
+      <w:r>
+        <w:t xml:space="preserve"> </w:t>
+      </w:r>
+      <w:r>
+        <w:rPr>
+          <w:b/>
+          <w:bCs/>
+        </w:rPr>
+        <w:t xml:space="preserve">Java 17 up to Java 25</w:t>
+      </w:r>
+      <w:r>
+        <w:t xml:space="preserve">,</w:t>
+      </w:r>
+      <w:r>
+        <w:t xml:space="preserve"> </w:t>
+      </w:r>
+      <w:r>
+        <w:t xml:space="preserve">so the Java that comes with a recent Android Studio works without changing any setting.</w:t>
+      </w:r>
     </w:p>
     <w:p>
       <w:pPr>
@@ -18378,7 +18434,7 @@
         <w:t xml:space="preserve"> </w:t>
       </w:r>
       <w:r>
-        <w:t xml:space="preserve">(the first time it downloads Gradle 8.7 and the libraries, so an internet connection is required).</w:t>
+        <w:t xml:space="preserve">(the first time it downloads Gradle 9.1.0 and the libraries, so an internet connection is required).</w:t>
       </w:r>
     </w:p>
     <w:p>
@@ -18507,80 +18563,26 @@
           <w:b/>
           <w:bCs/>
         </w:rPr>
-        <w:t xml:space="preserve">“Incompatible Gradle JVM version … Gradle 8.7 supports Java versions between 1.8 and 21”</w:t>
-      </w:r>
-      <w:r>
-        <w:t xml:space="preserve">: Android Studio is</w:t>
-      </w:r>
-      <w:r>
-        <w:t xml:space="preserve"> </w:t>
-      </w:r>
-      <w:r>
-        <w:t xml:space="preserve">using a too-new Java (e.g. Java 25) to run Gradle. Click</w:t>
-      </w:r>
-      <w:r>
-        <w:t xml:space="preserve"> </w:t>
-      </w:r>
-      <w:r>
-        <w:rPr>
-          <w:b/>
-          <w:bCs/>
-        </w:rPr>
-        <w:t xml:space="preserve">“Apply compatible Gradle JDK configuration and sync”</w:t>
-      </w:r>
-      <w:r>
-        <w:t xml:space="preserve">, or go to</w:t>
-      </w:r>
-      <w:r>
-        <w:t xml:space="preserve"> </w:t>
-      </w:r>
-      <w:r>
-        <w:rPr>
-          <w:b/>
-          <w:bCs/>
-        </w:rPr>
-        <w:t xml:space="preserve">Settings → Build, Execution, Deployment → Build Tools → Gradle → Gradle JDK</w:t>
-      </w:r>
-      <w:r>
-        <w:t xml:space="preserve"> </w:t>
-      </w:r>
-      <w:r>
-        <w:t xml:space="preserve">and choose</w:t>
-      </w:r>
-      <w:r>
-        <w:t xml:space="preserve"> </w:t>
-      </w:r>
-      <w:r>
-        <w:rPr>
-          <w:b/>
-          <w:bCs/>
-        </w:rPr>
-        <w:t xml:space="preserve">jbr-21</w:t>
-      </w:r>
-      <w:r>
-        <w:t xml:space="preserve"> </w:t>
-      </w:r>
-      <w:r>
-        <w:t xml:space="preserve">(JetBrains</w:t>
-      </w:r>
-      <w:r>
-        <w:t xml:space="preserve"> </w:t>
-      </w:r>
-      <w:r>
-        <w:t xml:space="preserve">Runtime 21, included with Android Studio) or Java 17, then</w:t>
-      </w:r>
-      <w:r>
-        <w:t xml:space="preserve"> </w:t>
-      </w:r>
-      <w:r>
-        <w:rPr>
-          <w:b/>
-          <w:bCs/>
-        </w:rPr>
-        <w:t xml:space="preserve">File → Sync Project with Gradle Files</w:t>
-      </w:r>
-      <w:r>
-        <w:t xml:space="preserve">.</w:t>
+        <w:t xml:space="preserve">“The project is using an incompatible version of the Android Gradle plugin”</w:t>
+      </w:r>
+      <w:r>
+        <w:t xml:space="preserve">: your Android Studio is older than</w:t>
+      </w:r>
+      <w:r>
+        <w:t xml:space="preserve"> </w:t>
+      </w:r>
+      <w:r>
+        <w:t xml:space="preserve">Panda (2025.3.1). Update Android Studio (</w:t>
+      </w:r>
+      <w:r>
+        <w:rPr>
+          <w:b/>
+          <w:bCs/>
+        </w:rPr>
+        <w:t xml:space="preserve">Help → Check for Updates</w:t>
+      </w:r>
+      <w:r>
+        <w:t xml:space="preserve">).</w:t>
       </w:r>
     </w:p>
     <w:p>
@@ -18645,7 +18647,7 @@
         <w:rPr>
           <w:rStyle w:val="VerbatimChar"/>
         </w:rPr>
-        <w:t xml:space="preserve">├── settings.gradle.kts, build.gradle.kts, gradle.properties, gradlew   (Gradle 8.7, AGP 8.5.0, Kotlin 2.0.21)</w:t>
+        <w:t xml:space="preserve">├── settings.gradle.kts, build.gradle.kts, gradle.properties, gradlew   (Gradle 9.1.0, AGP 9.0.1, Kotlin 2.2.21, Google Services 4.4.4)</w:t>
       </w:r>
       <w:r>
         <w:br/>

</xml_diff>